<commit_message>
Use 伊坤朋 as the sole Chinese name on the site
Match the RCEES faculty page (xm=伊坤朋). English remains Kunpeng Yi.
Remove the old 易昆鹏 display-name hedging in UI, metadata, JSON-LD, OG, README, and CV headers.

Co-authored-by: yikunpeng82 <yikunpeng82@gmail.com>
</commit_message>
<xml_diff>
--- a/public/cv/kunpeng-yi-cv-zh.docx
+++ b/public/cv/kunpeng-yi-cv-zh.docx
@@ -8,7 +8,7 @@
           <w:b/>
           <w:sz w:val="36"/>
         </w:rPr>
-        <w:t>个人简介 — 易昆鹏（Kunpeng Yi）</w:t>
+        <w:t>个人简介 — 伊坤朋（Kunpeng Yi）</w:t>
       </w:r>
     </w:p>
     <w:p>
@@ -23,7 +23,7 @@
     </w:p>
     <w:p>
       <w:r>
-        <w:t>姓名（本站）：易昆鹏</w:t>
+        <w:t>姓名：伊坤朋</w:t>
       </w:r>
     </w:p>
     <w:p>
@@ -34,11 +34,6 @@
     <w:p>
       <w:r>
         <w:t>职务：中国科学院生态环境研究中心副研究员</w:t>
-      </w:r>
-    </w:p>
-    <w:p>
-      <w:r>
-        <w:t>本简介原文及部分中国科学院、国科大、实验室页面写作伊坤朋。本站对外中文名保持易昆鹏。</w:t>
       </w:r>
     </w:p>
     <w:p>

</xml_diff>